<commit_message>
docs(labs): add report templates
</commit_message>
<xml_diff>
--- a/docs/lab-1/report.docx
+++ b/docs/lab-1/report.docx
@@ -545,7 +545,6 @@
           <w:kern w:val="0"/>
           <w:sz w:val="24"/>
           <w:szCs w:val="24"/>
-          <w:lang w:val="en-US"/>
           <w14:ligatures w14:val="none"/>
         </w:rPr>
       </w:pPr>
@@ -618,10 +617,13 @@
     <w:sdt>
       <w:sdtPr>
         <w:rPr>
-          <w:rFonts w:ascii="Times New Roman" w:hAnsi="Times New Roman" w:cs="Times New Roman"/>
+          <w:rFonts w:ascii="Times New Roman" w:eastAsiaTheme="minorHAnsi" w:hAnsi="Times New Roman" w:cs="Times New Roman"/>
           <w:color w:val="000000" w:themeColor="text1"/>
+          <w:kern w:val="2"/>
           <w:sz w:val="28"/>
           <w:szCs w:val="28"/>
+          <w:lang w:eastAsia="en-US"/>
+          <w14:ligatures w14:val="standardContextual"/>
         </w:rPr>
         <w:id w:val="-151066974"/>
         <w:docPartObj>
@@ -631,12 +633,8 @@
       </w:sdtPr>
       <w:sdtEndPr>
         <w:rPr>
-          <w:rFonts w:eastAsiaTheme="minorHAnsi"/>
           <w:b/>
           <w:bCs/>
-          <w:kern w:val="2"/>
-          <w:lang w:eastAsia="en-US"/>
-          <w14:ligatures w14:val="standardContextual"/>
         </w:rPr>
       </w:sdtEndPr>
       <w:sdtContent>
@@ -9458,9 +9456,27 @@
             <w:sz w:val="28"/>
             <w:szCs w:val="28"/>
           </w:rPr>
-          <w:t>https://github.com/ahmadeev/ipm-lab-1</w:t>
+          <w:t>https://github.com/ahmadeev/ipm-lab</w:t>
+        </w:r>
+        <w:r>
+          <w:rPr>
+            <w:rStyle w:val="ad"/>
+            <w:rFonts w:ascii="Times New Roman" w:hAnsi="Times New Roman" w:cs="Times New Roman"/>
+            <w:sz w:val="28"/>
+            <w:szCs w:val="28"/>
+            <w:lang w:val="en-US"/>
+          </w:rPr>
+          <w:t>s</w:t>
         </w:r>
       </w:hyperlink>
+      <w:r>
+        <w:rPr>
+          <w:rFonts w:ascii="Times New Roman" w:hAnsi="Times New Roman" w:cs="Times New Roman"/>
+          <w:sz w:val="28"/>
+          <w:szCs w:val="28"/>
+        </w:rPr>
+        <w:t xml:space="preserve"> </w:t>
+      </w:r>
       <w:r>
         <w:rPr>
           <w:rStyle w:val="ad"/>
@@ -10297,6 +10313,16 @@
                 <w:color w:val="000000" w:themeColor="text1"/>
                 <w:sz w:val="24"/>
                 <w:szCs w:val="24"/>
+                <w:lang w:val="en-US"/>
+              </w:rPr>
+              <w:t>-</w:t>
+            </w:r>
+            <w:r>
+              <w:rPr>
+                <w:rFonts w:ascii="Times New Roman" w:eastAsia="Calibri" w:hAnsi="Times New Roman" w:cs="Times New Roman"/>
+                <w:color w:val="000000" w:themeColor="text1"/>
+                <w:sz w:val="24"/>
+                <w:szCs w:val="24"/>
               </w:rPr>
               <w:t>1.00</w:t>
             </w:r>
@@ -11893,8 +11919,18 @@
                 <w:color w:val="000000" w:themeColor="text1"/>
                 <w:sz w:val="24"/>
                 <w:szCs w:val="24"/>
-              </w:rPr>
-              <w:t>2.00</w:t>
+                <w:lang w:val="en-US"/>
+              </w:rPr>
+              <w:t>8</w:t>
+            </w:r>
+            <w:r>
+              <w:rPr>
+                <w:rFonts w:ascii="Times New Roman" w:eastAsia="Calibri" w:hAnsi="Times New Roman" w:cs="Times New Roman"/>
+                <w:color w:val="000000" w:themeColor="text1"/>
+                <w:sz w:val="24"/>
+                <w:szCs w:val="24"/>
+              </w:rPr>
+              <w:t>.00</w:t>
             </w:r>
           </w:p>
         </w:tc>
@@ -16545,6 +16581,7 @@
         <w:rPr>
           <w:rFonts w:ascii="Times New Roman" w:eastAsia="Calibri" w:hAnsi="Times New Roman" w:cs="Times New Roman"/>
           <w:b/>
+          <w:noProof/>
           <w:color w:val="000000" w:themeColor="text1"/>
           <w:kern w:val="0"/>
           <w:sz w:val="28"/>
@@ -16553,10 +16590,10 @@
         </w:rPr>
         <w:lastRenderedPageBreak/>
         <w:drawing>
-          <wp:inline distT="0" distB="0" distL="0" distR="0" wp14:anchorId="1D791C49" wp14:editId="4F2D8BC6">
-            <wp:extent cx="6152515" cy="5132705"/>
-            <wp:effectExtent l="19050" t="19050" r="19685" b="10795"/>
-            <wp:docPr id="1317316934" name="Рисунок 1" descr="Изображение выглядит как диаграмма, дизайн, стол&#10;&#10;Содержимое, созданное искусственным интеллектом, может быть неверным."/>
+          <wp:inline distT="0" distB="0" distL="0" distR="0" wp14:anchorId="1D791C49" wp14:editId="1A2BB4FD">
+            <wp:extent cx="5815121" cy="5132705"/>
+            <wp:effectExtent l="19050" t="19050" r="14605" b="10795"/>
+            <wp:docPr id="1317316934" name="Рисунок 1"/>
             <wp:cNvGraphicFramePr>
               <a:graphicFrameLocks xmlns:a="http://schemas.openxmlformats.org/drawingml/2006/main" noChangeAspect="1"/>
             </wp:cNvGraphicFramePr>
@@ -16564,11 +16601,17 @@
               <a:graphicData uri="http://schemas.openxmlformats.org/drawingml/2006/picture">
                 <pic:pic xmlns:pic="http://schemas.openxmlformats.org/drawingml/2006/picture">
                   <pic:nvPicPr>
-                    <pic:cNvPr id="1317316934" name="Рисунок 1" descr="Изображение выглядит как диаграмма, дизайн, стол&#10;&#10;Содержимое, созданное искусственным интеллектом, может быть неверным."/>
+                    <pic:cNvPr id="1317316934" name="Рисунок 1"/>
                     <pic:cNvPicPr/>
                   </pic:nvPicPr>
                   <pic:blipFill>
-                    <a:blip r:embed="rId8"/>
+                    <a:blip r:embed="rId8">
+                      <a:extLst>
+                        <a:ext uri="{28A0092B-C50C-407E-A947-70E740481C1C}">
+                          <a14:useLocalDpi xmlns:a14="http://schemas.microsoft.com/office/drawing/2010/main" val="0"/>
+                        </a:ext>
+                      </a:extLst>
+                    </a:blip>
                     <a:stretch>
                       <a:fillRect/>
                     </a:stretch>
@@ -16576,7 +16619,7 @@
                   <pic:spPr>
                     <a:xfrm>
                       <a:off x="0" y="0"/>
-                      <a:ext cx="6152515" cy="5132705"/>
+                      <a:ext cx="5815121" cy="5132705"/>
                     </a:xfrm>
                     <a:prstGeom prst="rect">
                       <a:avLst/>
@@ -16654,43 +16697,21 @@
         <w:r>
           <w:rPr>
             <w:rStyle w:val="ad"/>
-            <w:rFonts w:ascii="Times New Roman" w:eastAsia="Calibri" w:hAnsi="Times New Roman" w:cs="Times New Roman"/>
-            <w:bCs/>
-            <w:kern w:val="0"/>
+            <w:rFonts w:ascii="Times New Roman" w:hAnsi="Times New Roman" w:cs="Times New Roman"/>
             <w:sz w:val="28"/>
             <w:szCs w:val="28"/>
-            <w14:ligatures w14:val="none"/>
           </w:rPr>
-          <w:t>https://www.desmos.com/3d/v8p8chcdpn?lang=ru</w:t>
+          <w:t>https://www.desmos.com/3d/4k1ah1cxgy?lang=ru</w:t>
         </w:r>
       </w:hyperlink>
       <w:r>
         <w:rPr>
-          <w:rFonts w:ascii="Times New Roman" w:eastAsia="Calibri" w:hAnsi="Times New Roman" w:cs="Times New Roman"/>
-          <w:bCs/>
-          <w:color w:val="000000" w:themeColor="text1"/>
-          <w:kern w:val="0"/>
+          <w:rFonts w:ascii="Times New Roman" w:hAnsi="Times New Roman" w:cs="Times New Roman"/>
           <w:sz w:val="28"/>
           <w:szCs w:val="28"/>
-          <w14:ligatures w14:val="none"/>
         </w:rPr>
         <w:t xml:space="preserve"> </w:t>
       </w:r>
-    </w:p>
-    <w:p>
-      <w:pPr>
-        <w:spacing w:before="100" w:beforeAutospacing="1" w:after="100" w:afterAutospacing="1" w:line="360" w:lineRule="auto"/>
-        <w:contextualSpacing/>
-        <w:rPr>
-          <w:rFonts w:ascii="Times New Roman" w:eastAsia="Calibri" w:hAnsi="Times New Roman" w:cs="Times New Roman"/>
-          <w:bCs/>
-          <w:color w:val="000000" w:themeColor="text1"/>
-          <w:kern w:val="0"/>
-          <w:sz w:val="28"/>
-          <w:szCs w:val="28"/>
-          <w14:ligatures w14:val="none"/>
-        </w:rPr>
-      </w:pPr>
       <w:r>
         <w:rPr>
           <w:rFonts w:ascii="Times New Roman" w:eastAsia="Calibri" w:hAnsi="Times New Roman" w:cs="Times New Roman"/>
@@ -18115,6 +18136,7 @@
   <w:style w:type="character" w:default="1" w:styleId="a0">
     <w:name w:val="Default Paragraph Font"/>
     <w:uiPriority w:val="1"/>
+    <w:semiHidden/>
     <w:unhideWhenUsed/>
   </w:style>
   <w:style w:type="table" w:default="1" w:styleId="a1">
@@ -18532,6 +18554,18 @@
       <w:color w:val="666666"/>
     </w:rPr>
   </w:style>
+  <w:style w:type="character" w:styleId="af1">
+    <w:name w:val="FollowedHyperlink"/>
+    <w:basedOn w:val="a0"/>
+    <w:uiPriority w:val="99"/>
+    <w:semiHidden/>
+    <w:unhideWhenUsed/>
+    <w:rsid w:val="00A05FFD"/>
+    <w:rPr>
+      <w:color w:val="96607D" w:themeColor="followedHyperlink"/>
+      <w:u w:val="single"/>
+    </w:rPr>
+  </w:style>
 </w:styles>
 </file>
 
@@ -18654,9 +18688,15 @@
   </w:compat>
   <w:rsids>
     <w:rsidRoot w:val="00D50675"/>
+    <w:rsid w:val="001C2F88"/>
+    <w:rsid w:val="00404351"/>
+    <w:rsid w:val="0046694D"/>
+    <w:rsid w:val="005F6AF0"/>
     <w:rsid w:val="006878B5"/>
     <w:rsid w:val="00AF1E5C"/>
+    <w:rsid w:val="00D020E9"/>
     <w:rsid w:val="00D50675"/>
+    <w:rsid w:val="00EF6929"/>
   </w:rsids>
   <m:mathPr>
     <m:mathFont m:val="Cambria Math"/>

</xml_diff>